<commit_message>
Add Primary Domain row to all 5 Entity PRDs and bump versions
All Entity PRDs now have an explicit Primary Domain row in their
Entity Overview table, eliminating the fallback path in the Path B
adapter (Bug 6). Verified against Entity Inventory detail cards.

- Contact v1.3 → v1.4: Primary Domain = Mentoring (MN)
- Account v1.3 → v1.4: Primary Domain = Mentoring (MN)
- Engagement v1.1 → v1.2: Primary Domain = Mentoring (MN)
- Session v1.0 → v1.1: Primary Domain = Mentoring (MN)
- Dues v1.0 → v1.1: Primary Domain = Mentor Recruitment (MR)

CLAUDE.md updated with new versions and backfill summary.

Co-Authored-By: Claude Opus 4.6 (1M context) <noreply@anthropic.com>
</commit_message>
<xml_diff>
--- a/PRDs/entities/Account-Entity-PRD.docx
+++ b/PRDs/entities/Account-Entity-PRD.docx
@@ -300,7 +300,7 @@
           </w:tcPr>
           <w:p>
             <w:r>
-              <w:t>1.3</w:t>
+              <w:t>1.4</w:t>
             </w:r>
           </w:p>
         </w:tc>
@@ -421,7 +421,7 @@
           </w:tcPr>
           <w:p>
             <w:r>
-              <w:t>04-09-26 10:05</w:t>
+              <w:t>04-15-26 23:20</w:t>
             </w:r>
           </w:p>
         </w:tc>
@@ -917,6 +917,70 @@
                 <w:szCs w:val="20"/>
               </w:rPr>
               <w:t xml:space="preserve">Yes</w:t>
+            </w:r>
+          </w:p>
+        </w:tc>
+      </w:tr>
+      <w:tr>
+        <w:tc>
+          <w:tcPr>
+            <w:tcW w:type="dxa" w:w="2800"/>
+            <w:tcBorders>
+              <w:top w:val="single" w:color="AAAAAA" w:sz="1"/>
+              <w:left w:val="single" w:color="AAAAAA" w:sz="1"/>
+              <w:bottom w:val="single" w:color="AAAAAA" w:sz="1"/>
+              <w:right w:val="single" w:color="AAAAAA" w:sz="1"/>
+            </w:tcBorders>
+            <w:tcMar>
+              <w:top w:type="dxa" w:w="60"/>
+              <w:left w:type="dxa" w:w="100"/>
+              <w:bottom w:type="dxa" w:w="60"/>
+              <w:right w:type="dxa" w:w="100"/>
+            </w:tcMar>
+          </w:tcPr>
+          <w:p>
+            <w:r>
+              <w:rPr>
+                <w:rFonts w:ascii="Arial" w:cs="Arial" w:eastAsia="Arial" w:hAnsi="Arial"/>
+                <w:b/>
+                <w:bCs/>
+                <w:i w:val="false"/>
+                <w:iCs w:val="false"/>
+                <w:sz w:val="20"/>
+                <w:szCs w:val="20"/>
+              </w:rPr>
+              <w:t>Primary Domain</w:t>
+            </w:r>
+          </w:p>
+        </w:tc>
+        <w:tc>
+          <w:tcPr>
+            <w:tcW w:type="dxa" w:w="6560"/>
+            <w:tcBorders>
+              <w:top w:val="single" w:color="AAAAAA" w:sz="1"/>
+              <w:left w:val="single" w:color="AAAAAA" w:sz="1"/>
+              <w:bottom w:val="single" w:color="AAAAAA" w:sz="1"/>
+              <w:right w:val="single" w:color="AAAAAA" w:sz="1"/>
+            </w:tcBorders>
+            <w:tcMar>
+              <w:top w:type="dxa" w:w="60"/>
+              <w:left w:type="dxa" w:w="100"/>
+              <w:bottom w:type="dxa" w:w="60"/>
+              <w:right w:type="dxa" w:w="100"/>
+            </w:tcMar>
+          </w:tcPr>
+          <w:p>
+            <w:r>
+              <w:rPr>
+                <w:rFonts w:ascii="Arial" w:cs="Arial" w:eastAsia="Arial" w:hAnsi="Arial"/>
+                <w:b w:val="false"/>
+                <w:bCs w:val="false"/>
+                <w:i w:val="false"/>
+                <w:iCs w:val="false"/>
+                <w:sz w:val="20"/>
+                <w:szCs w:val="20"/>
+              </w:rPr>
+              <w:t>Mentoring (MN)</w:t>
             </w:r>
           </w:p>
         </w:tc>

</xml_diff>

<commit_message>
Fix Contact and Account Entity PRD v1.5: correct field IDs to provenance convention
Contact Entity PRD v1.5 (replaces prior v1.5):
- Field IDs use provenance tags (CR-EVENTS SDO, CR-EVENTS-CONVERT-DAT-024,
  CR-REACTIVATE SDO) matching every other field in the document
- Activity tracking fields in new Section 3.7 (not appended to 3.5)
- Add CON-DEC-015 documenting v1.5 consolidation rationale
- Presenter bullet removed from Section 3.4 (not revised in place)

Account Entity PRD v1.5 (surgical fix to prior v1.5):
- applicantSince ID: CR-EVENTS-CONVERT-DAT-025 (was ACT-FLD-001)
- Description: MN-INTAKE REQ-011 updated in v2.4 (was pending update)
- Last Updated: 04-16-26 23:29
</commit_message>
<xml_diff>
--- a/PRDs/entities/Account-Entity-PRD.docx
+++ b/PRDs/entities/Account-Entity-PRD.docx
@@ -421,7 +421,7 @@
           </w:tcPr>
           <w:p>
             <w:r>
-              <w:t>04-16-26 00:45</w:t>
+              <w:t>04-16-26 23:29</w:t>
             </w:r>
           </w:p>
         </w:tc>
@@ -6868,7 +6868,7 @@
           </w:tcPr>
           <w:p>
             <w:r>
-              <w:t>ACT-FLD-001</w:t>
+              <w:t>CR-EVENTS-CONVERT-DAT-025</w:t>
             </w:r>
           </w:p>
         </w:tc>
@@ -6881,7 +6881,7 @@
           </w:tcPr>
           <w:p>
             <w:r>
-              <w:t>Timestamp recording when this Account’s clientStatus first transitioned to Applicant. System-populated by MN-INTAKE (REQ-011, pending update). The “if currently null” guard ensures the timestamp records the first time the account reached Applicant status, not subsequent re-applications. Used by CR-EVENTS-CONVERT as the application-side anchor for conversion window calculation. Source: CR-EVENTS-CONVERT v1.0. Domains: CR, MN.</w:t>
+              <w:t>Timestamp recording when this Account’s clientStatus first transitioned to Applicant. System-populated by MN-INTAKE (REQ-011, updated in v2.4). The “if currently null” guard ensures the timestamp records the first time the account reached Applicant status, not subsequent re-applications. Used by CR-EVENTS-CONVERT as the application-side anchor for conversion window calculation. Source: CR-EVENTS-CONVERT v1.0. Domains: CR, MN.</w:t>
             </w:r>
           </w:p>
         </w:tc>

</xml_diff>